<commit_message>
Add P7 smart print queue kiosk, update to 7 projects
</commit_message>
<xml_diff>
--- a/IoT_Projects_PEMRT525.docx
+++ b/IoT_Projects_PEMRT525.docx
@@ -93,7 +93,7 @@
                 <w:sz w:val="24"/>
                 <w:szCs w:val="24"/>
               </w:rPr>
-              <w:t xml:space="preserve">CIE Project Topics  |  6 Projects  |  Batch MR 2K24  |  Academic Year 2025–26</w:t>
+              <w:t xml:space="preserve">CIE Project Topics  |  7 Projects  |  Batch MR 2K24  |  Academic Year 2025–26</w:t>
             </w:r>
           </w:p>
         </w:tc>
@@ -1135,7 +1135,7 @@
                 <w:sz w:val="20"/>
                 <w:szCs w:val="20"/>
               </w:rPr>
-              <w:t xml:space="preserve">P6</w:t>
+              <w:t xml:space="preserve">P7</w:t>
             </w:r>
           </w:p>
         </w:tc>
@@ -1173,7 +1173,7 @@
                 <w:sz w:val="20"/>
                 <w:szCs w:val="20"/>
               </w:rPr>
-              <w:t xml:space="preserve">College Bus Tracker — Initial Version (WiFi Hotspot)</w:t>
+              <w:t xml:space="preserve">Smart Print Queue Kiosk with Paper Level Detection</w:t>
             </w:r>
           </w:p>
         </w:tc>
@@ -1211,7 +1211,7 @@
                 <w:sz w:val="19"/>
                 <w:szCs w:val="19"/>
               </w:rPr>
-              <w:t xml:space="preserve">ESP32</w:t>
+              <w:t xml:space="preserve">Raspberry Pi 3/4</w:t>
             </w:r>
           </w:p>
         </w:tc>
@@ -1250,6 +1250,163 @@
                 <w:szCs w:val="19"/>
               </w:rPr>
               <w:t xml:space="preserve">WiFi / Mobile</w:t>
+            </w:r>
+          </w:p>
+        </w:tc>
+      </w:tr>
+      <w:tr>
+        <w:trPr>
+          <w:tblHeader w:val="false"/>
+        </w:trPr>
+        <w:tc>
+          <w:tcPr>
+            <w:tcW w:type="dxa" w:w="780"/>
+            <w:tcBorders>
+              <w:top w:val="single" w:color="AAAAAA" w:sz="1"/>
+              <w:left w:val="single" w:color="AAAAAA" w:sz="1"/>
+              <w:bottom w:val="single" w:color="AAAAAA" w:sz="1"/>
+              <w:right w:val="single" w:color="AAAAAA" w:sz="1"/>
+            </w:tcBorders>
+            <w:shd w:fill="E1F5FE" w:val="clear"/>
+            <w:tcMar>
+              <w:top w:type="dxa" w:w="80"/>
+              <w:left w:type="dxa" w:w="140"/>
+              <w:bottom w:type="dxa" w:w="80"/>
+              <w:right w:type="dxa" w:w="140"/>
+            </w:tcMar>
+            <w:vAlign w:val="top"/>
+          </w:tcPr>
+          <w:p>
+            <w:pPr>
+              <w:spacing w:after="80" w:before="0"/>
+              <w:jc w:val="center"/>
+            </w:pPr>
+            <w:r>
+              <w:rPr>
+                <w:rFonts w:ascii="Arial" w:cs="Arial" w:eastAsia="Arial" w:hAnsi="Arial"/>
+                <w:b/>
+                <w:bCs/>
+                <w:i w:val="false"/>
+                <w:iCs w:val="false"/>
+                <w:color w:val="01579B"/>
+                <w:sz w:val="20"/>
+                <w:szCs w:val="20"/>
+              </w:rPr>
+              <w:t xml:space="preserve">P6</w:t>
+            </w:r>
+          </w:p>
+        </w:tc>
+        <w:tc>
+          <w:tcPr>
+            <w:tcW w:type="dxa" w:w="4680"/>
+            <w:tcBorders>
+              <w:top w:val="single" w:color="AAAAAA" w:sz="1"/>
+              <w:left w:val="single" w:color="AAAAAA" w:sz="1"/>
+              <w:bottom w:val="single" w:color="AAAAAA" w:sz="1"/>
+              <w:right w:val="single" w:color="AAAAAA" w:sz="1"/>
+            </w:tcBorders>
+            <w:shd w:fill="E1F5FE" w:val="clear"/>
+            <w:tcMar>
+              <w:top w:type="dxa" w:w="80"/>
+              <w:left w:type="dxa" w:w="140"/>
+              <w:bottom w:type="dxa" w:w="80"/>
+              <w:right w:type="dxa" w:w="140"/>
+            </w:tcMar>
+            <w:vAlign w:val="top"/>
+          </w:tcPr>
+          <w:p>
+            <w:pPr>
+              <w:spacing w:after="80" w:before="0"/>
+              <w:jc w:val="left"/>
+            </w:pPr>
+            <w:r>
+              <w:rPr>
+                <w:rFonts w:ascii="Arial" w:cs="Arial" w:eastAsia="Arial" w:hAnsi="Arial"/>
+                <w:b w:val="false"/>
+                <w:bCs w:val="false"/>
+                <w:i w:val="false"/>
+                <w:iCs w:val="false"/>
+                <w:color w:val="000000"/>
+                <w:sz w:val="20"/>
+                <w:szCs w:val="20"/>
+              </w:rPr>
+              <w:t xml:space="preserve">College Bus Tracker — Initial Version (WiFi Hotspot)</w:t>
+            </w:r>
+          </w:p>
+        </w:tc>
+        <w:tc>
+          <w:tcPr>
+            <w:tcW w:type="dxa" w:w="2340"/>
+            <w:tcBorders>
+              <w:top w:val="single" w:color="AAAAAA" w:sz="1"/>
+              <w:left w:val="single" w:color="AAAAAA" w:sz="1"/>
+              <w:bottom w:val="single" w:color="AAAAAA" w:sz="1"/>
+              <w:right w:val="single" w:color="AAAAAA" w:sz="1"/>
+            </w:tcBorders>
+            <w:shd w:fill="E1F5FE" w:val="clear"/>
+            <w:tcMar>
+              <w:top w:type="dxa" w:w="80"/>
+              <w:left w:type="dxa" w:w="140"/>
+              <w:bottom w:type="dxa" w:w="80"/>
+              <w:right w:type="dxa" w:w="140"/>
+            </w:tcMar>
+            <w:vAlign w:val="top"/>
+          </w:tcPr>
+          <w:p>
+            <w:pPr>
+              <w:spacing w:after="80" w:before="0"/>
+              <w:jc w:val="left"/>
+            </w:pPr>
+            <w:r>
+              <w:rPr>
+                <w:rFonts w:ascii="Arial" w:cs="Arial" w:eastAsia="Arial" w:hAnsi="Arial"/>
+                <w:b w:val="false"/>
+                <w:bCs w:val="false"/>
+                <w:i w:val="false"/>
+                <w:iCs w:val="false"/>
+                <w:color w:val="000000"/>
+                <w:sz w:val="19"/>
+                <w:szCs w:val="19"/>
+              </w:rPr>
+              <w:t xml:space="preserve">ESP32</w:t>
+            </w:r>
+          </w:p>
+        </w:tc>
+        <w:tc>
+          <w:tcPr>
+            <w:tcW w:type="dxa" w:w="1560"/>
+            <w:tcBorders>
+              <w:top w:val="single" w:color="AAAAAA" w:sz="1"/>
+              <w:left w:val="single" w:color="AAAAAA" w:sz="1"/>
+              <w:bottom w:val="single" w:color="AAAAAA" w:sz="1"/>
+              <w:right w:val="single" w:color="AAAAAA" w:sz="1"/>
+            </w:tcBorders>
+            <w:shd w:fill="E1F5FE" w:val="clear"/>
+            <w:tcMar>
+              <w:top w:type="dxa" w:w="80"/>
+              <w:left w:type="dxa" w:w="140"/>
+              <w:bottom w:type="dxa" w:w="80"/>
+              <w:right w:type="dxa" w:w="140"/>
+            </w:tcMar>
+            <w:vAlign w:val="top"/>
+          </w:tcPr>
+          <w:p>
+            <w:pPr>
+              <w:spacing w:after="80" w:before="0"/>
+              <w:jc w:val="left"/>
+            </w:pPr>
+            <w:r>
+              <w:rPr>
+                <w:rFonts w:ascii="Arial" w:cs="Arial" w:eastAsia="Arial" w:hAnsi="Arial"/>
+                <w:b w:val="false"/>
+                <w:bCs w:val="false"/>
+                <w:i w:val="false"/>
+                <w:iCs w:val="false"/>
+                <w:color w:val="000000"/>
+                <w:sz w:val="19"/>
+                <w:szCs w:val="19"/>
+              </w:rPr>
+              <w:t xml:space="preserve">Wi-Fi LAN</w:t>
             </w:r>
           </w:p>
         </w:tc>
@@ -5396,6 +5553,804 @@
       <w:tblPr>
         <w:tblW w:type="dxa" w:w="9360"/>
         <w:tblBorders>
+          <w:top w:val="single" w:color="01579B" w:sz="3"/>
+          <w:left w:val="single" w:color="01579B" w:sz="6"/>
+          <w:bottom w:val="single" w:color="01579B" w:sz="3"/>
+          <w:right w:val="single" w:color="01579B" w:sz="3"/>
+          <w:insideH w:val="single" w:color="auto" w:sz="4"/>
+          <w:insideV w:val="single" w:color="auto" w:sz="4"/>
+        </w:tblBorders>
+      </w:tblPr>
+      <w:tblGrid>
+        <w:gridCol w:w="9360"/>
+      </w:tblGrid>
+      <w:tr>
+        <w:trPr>
+          <w:tblHeader/>
+        </w:trPr>
+        <w:tc>
+          <w:tcPr>
+            <w:tcW w:type="dxa" w:w="9360"/>
+            <w:tcBorders>
+              <w:top w:val="none" w:color="FFFFFF" w:sz="0"/>
+              <w:left w:val="none" w:color="FFFFFF" w:sz="0"/>
+              <w:bottom w:val="none" w:color="FFFFFF" w:sz="0"/>
+              <w:right w:val="none" w:color="FFFFFF" w:sz="0"/>
+            </w:tcBorders>
+            <w:shd w:fill="01579B" w:val="clear"/>
+            <w:tcMar>
+              <w:top w:type="dxa" w:w="80"/>
+              <w:left w:type="dxa" w:w="140"/>
+              <w:bottom w:type="dxa" w:w="80"/>
+              <w:right w:type="dxa" w:w="140"/>
+            </w:tcMar>
+            <w:vAlign w:val="top"/>
+          </w:tcPr>
+          <w:p>
+            <w:pPr>
+              <w:spacing w:after="20" w:before="60"/>
+              <w:jc w:val="left"/>
+            </w:pPr>
+            <w:r>
+              <w:rPr>
+                <w:rFonts w:ascii="Arial" w:cs="Arial" w:eastAsia="Arial" w:hAnsi="Arial"/>
+                <w:b/>
+                <w:bCs/>
+                <w:i w:val="false"/>
+                <w:iCs w:val="false"/>
+                <w:color w:val="FFFFFF"/>
+                <w:sz w:val="26"/>
+                <w:szCs w:val="26"/>
+              </w:rPr>
+              <w:t xml:space="preserve">P7  —  Smart Print Queue Kiosk with Paper Level Detection</w:t>
+            </w:r>
+          </w:p>
+          <w:p>
+            <w:pPr>
+              <w:spacing w:after="60" w:before="0"/>
+              <w:jc w:val="left"/>
+            </w:pPr>
+            <w:r>
+              <w:rPr>
+                <w:rFonts w:ascii="Arial" w:cs="Arial" w:eastAsia="Arial" w:hAnsi="Arial"/>
+                <w:b w:val="false"/>
+                <w:bCs w:val="false"/>
+                <w:i w:val="false"/>
+                <w:iCs w:val="false"/>
+                <w:color w:val="DEEAF1"/>
+                <w:sz w:val="19"/>
+                <w:szCs w:val="19"/>
+              </w:rPr>
+              <w:t xml:space="preserve">Module 2 &amp; 4   |   CO2, CO5</w:t>
+            </w:r>
+          </w:p>
+        </w:tc>
+      </w:tr>
+      <w:tr>
+        <w:trPr>
+          <w:tblHeader w:val="false"/>
+        </w:trPr>
+        <w:tc>
+          <w:tcPr>
+            <w:tcW w:type="dxa" w:w="9360"/>
+            <w:tcBorders>
+              <w:top w:val="single" w:color="CCCCCC" w:sz="1"/>
+              <w:left w:val="single" w:color="CCCCCC" w:sz="1"/>
+              <w:bottom w:val="single" w:color="CCCCCC" w:sz="1"/>
+              <w:right w:val="single" w:color="CCCCCC" w:sz="1"/>
+            </w:tcBorders>
+            <w:tcMar>
+              <w:top w:type="dxa" w:w="80"/>
+              <w:left w:type="dxa" w:w="140"/>
+              <w:bottom w:type="dxa" w:w="80"/>
+              <w:right w:type="dxa" w:w="140"/>
+            </w:tcMar>
+            <w:vAlign w:val="top"/>
+          </w:tcPr>
+          <w:tbl>
+            <w:tblPr>
+              <w:tblW w:type="dxa" w:w="9260"/>
+              <w:tblBorders>
+                <w:top w:val="single" w:color="auto" w:sz="4"/>
+                <w:left w:val="single" w:color="auto" w:sz="4"/>
+                <w:bottom w:val="single" w:color="auto" w:sz="4"/>
+                <w:right w:val="single" w:color="auto" w:sz="4"/>
+                <w:insideH w:val="single" w:color="auto" w:sz="4"/>
+                <w:insideV w:val="single" w:color="auto" w:sz="4"/>
+              </w:tblBorders>
+            </w:tblPr>
+            <w:tblGrid>
+              <w:gridCol w:w="1600"/>
+              <w:gridCol w:w="7760"/>
+            </w:tblGrid>
+            <w:tr>
+              <w:trPr>
+                <w:tblHeader w:val="false"/>
+              </w:trPr>
+              <w:tc>
+                <w:tcPr>
+                  <w:tcW w:type="dxa" w:w="1600"/>
+                  <w:tcBorders>
+                    <w:top w:val="single" w:color="CCCCCC" w:sz="1"/>
+                    <w:left w:val="single" w:color="CCCCCC" w:sz="1"/>
+                    <w:bottom w:val="single" w:color="CCCCCC" w:sz="1"/>
+                    <w:right w:val="single" w:color="CCCCCC" w:sz="1"/>
+                  </w:tcBorders>
+                  <w:shd w:fill="E1F5FE" w:val="clear"/>
+                  <w:tcMar>
+                    <w:top w:type="dxa" w:w="80"/>
+                    <w:left w:type="dxa" w:w="140"/>
+                    <w:bottom w:type="dxa" w:w="80"/>
+                    <w:right w:type="dxa" w:w="140"/>
+                  </w:tcMar>
+                  <w:vAlign w:val="top"/>
+                </w:tcPr>
+                <w:p>
+                  <w:pPr>
+                    <w:spacing w:after="80" w:before="0"/>
+                    <w:jc w:val="left"/>
+                  </w:pPr>
+                  <w:r>
+                    <w:rPr>
+                      <w:rFonts w:ascii="Arial" w:cs="Arial" w:eastAsia="Arial" w:hAnsi="Arial"/>
+                      <w:b/>
+                      <w:bCs/>
+                      <w:i w:val="false"/>
+                      <w:iCs w:val="false"/>
+                      <w:color w:val="01579B"/>
+                      <w:sz w:val="20"/>
+                      <w:szCs w:val="20"/>
+                    </w:rPr>
+                    <w:t xml:space="preserve">Hardware</w:t>
+                  </w:r>
+                </w:p>
+              </w:tc>
+              <w:tc>
+                <w:tcPr>
+                  <w:tcW w:type="dxa" w:w="7760"/>
+                  <w:tcBorders>
+                    <w:top w:val="single" w:color="CCCCCC" w:sz="1"/>
+                    <w:left w:val="single" w:color="CCCCCC" w:sz="1"/>
+                    <w:bottom w:val="single" w:color="CCCCCC" w:sz="1"/>
+                    <w:right w:val="single" w:color="CCCCCC" w:sz="1"/>
+                  </w:tcBorders>
+                  <w:shd w:fill="FFFFFF" w:val="clear"/>
+                  <w:tcMar>
+                    <w:top w:type="dxa" w:w="80"/>
+                    <w:left w:type="dxa" w:w="140"/>
+                    <w:bottom w:type="dxa" w:w="80"/>
+                    <w:right w:type="dxa" w:w="140"/>
+                  </w:tcMar>
+                  <w:vAlign w:val="top"/>
+                </w:tcPr>
+                <w:p>
+                  <w:pPr>
+                    <w:spacing w:after="80" w:before="0"/>
+                    <w:jc w:val="left"/>
+                  </w:pPr>
+                  <w:r>
+                    <w:rPr>
+                      <w:rFonts w:ascii="Arial" w:cs="Arial" w:eastAsia="Arial" w:hAnsi="Arial"/>
+                      <w:b w:val="false"/>
+                      <w:bCs w:val="false"/>
+                      <w:i w:val="false"/>
+                      <w:iCs w:val="false"/>
+                      <w:color w:val="000000"/>
+                      <w:sz w:val="20"/>
+                      <w:szCs w:val="20"/>
+                    </w:rPr>
+                    <w:t xml:space="preserve">Raspberry Pi 3/4, load cell + HX711 ADC, USB hub, USB printer, TV/monitor</w:t>
+                  </w:r>
+                </w:p>
+              </w:tc>
+            </w:tr>
+          </w:tbl>
+          <w:p/>
+        </w:tc>
+      </w:tr>
+      <w:tr>
+        <w:trPr>
+          <w:tblHeader w:val="false"/>
+        </w:trPr>
+        <w:tc>
+          <w:tcPr>
+            <w:tcW w:type="dxa" w:w="9360"/>
+            <w:tcBorders>
+              <w:top w:val="none" w:color="FFFFFF" w:sz="0"/>
+              <w:left w:val="none" w:color="FFFFFF" w:sz="0"/>
+              <w:bottom w:val="none" w:color="FFFFFF" w:sz="0"/>
+              <w:right w:val="none" w:color="FFFFFF" w:sz="0"/>
+            </w:tcBorders>
+            <w:shd w:fill="01579B" w:val="clear"/>
+            <w:tcMar>
+              <w:top w:type="dxa" w:w="80"/>
+              <w:left w:type="dxa" w:w="140"/>
+              <w:bottom w:type="dxa" w:w="80"/>
+              <w:right w:type="dxa" w:w="140"/>
+            </w:tcMar>
+            <w:vAlign w:val="top"/>
+          </w:tcPr>
+          <w:p>
+            <w:pPr>
+              <w:spacing w:after="80" w:before="0"/>
+              <w:jc w:val="left"/>
+            </w:pPr>
+            <w:r>
+              <w:rPr>
+                <w:rFonts w:ascii="Arial" w:cs="Arial" w:eastAsia="Arial" w:hAnsi="Arial"/>
+                <w:b/>
+                <w:bCs/>
+                <w:i w:val="false"/>
+                <w:iCs w:val="false"/>
+                <w:color w:val="FFFFFF"/>
+                <w:sz w:val="20"/>
+                <w:szCs w:val="20"/>
+              </w:rPr>
+              <w:t xml:space="preserve">Problem Statement</w:t>
+            </w:r>
+          </w:p>
+        </w:tc>
+      </w:tr>
+      <w:tr>
+        <w:trPr>
+          <w:tblHeader w:val="false"/>
+        </w:trPr>
+        <w:tc>
+          <w:tcPr>
+            <w:tcW w:type="dxa" w:w="9360"/>
+            <w:tcBorders>
+              <w:top w:val="single" w:color="CCCCCC" w:sz="1"/>
+              <w:left w:val="single" w:color="CCCCCC" w:sz="1"/>
+              <w:bottom w:val="single" w:color="CCCCCC" w:sz="1"/>
+              <w:right w:val="single" w:color="CCCCCC" w:sz="1"/>
+            </w:tcBorders>
+            <w:shd w:fill="FFFFFF" w:val="clear"/>
+            <w:tcMar>
+              <w:top w:type="dxa" w:w="80"/>
+              <w:left w:type="dxa" w:w="140"/>
+              <w:bottom w:type="dxa" w:w="80"/>
+              <w:right w:type="dxa" w:w="140"/>
+            </w:tcMar>
+            <w:vAlign w:val="top"/>
+          </w:tcPr>
+          <w:p>
+            <w:pPr>
+              <w:spacing w:after="80" w:before="0"/>
+              <w:jc w:val="left"/>
+            </w:pPr>
+            <w:r>
+              <w:rPr>
+                <w:rFonts w:ascii="Arial" w:cs="Arial" w:eastAsia="Arial" w:hAnsi="Arial"/>
+                <w:b w:val="false"/>
+                <w:bCs w:val="false"/>
+                <w:i w:val="false"/>
+                <w:iCs w:val="false"/>
+                <w:color w:val="000000"/>
+                <w:sz w:val="20"/>
+                <w:szCs w:val="20"/>
+              </w:rPr>
+              <w:t xml:space="preserve">JECC has a printing service on campus but students face long physical queues — especially before assignment deadlines, exam season, and lab record days. Students must stand and wait with no visibility of queue status. Operators receive files via WhatsApp or USB pen drive, creating disorganised job handling with no tracking or accountability. Additionally, the operator has no way to monitor paper level in the printer tray without manually checking, leading to mid-job paper exhaustion and further delays.
+Design a Raspberry Pi-based Smart Print Queue Kiosk that eliminates the physical queue and adds live paper level monitoring:
+Student — Submit print job remotely from anywhere on college LAN:
+• Web portal (phone/laptop browser) → upload PDF/DOCX/image, select copies, B&amp;W or colour, enter name and roll number → job added to queue instantly
+• USB pen drive → plug into kiosk → select file from on-screen list → added to queue
+• System assigns a token number and estimated wait time
+Paper Level Detection (Load Cell + HX711):
+• Paper tray placed on load cell sensor → HX711 ADC reads weight → RPi calculates remaining sheets
+• A4 70 GSM: 1 sheet ≈ 5g → 500 sheets ≈ 2500g
+• Live paper count on operator screen and queue display board
+• Alert triggered automatically when paper drops below 50 sheets
+Operator Screen: Live job queue (token, name, file, pages, status), live paper count with low-paper alert, one-click print via CUPS, mark job as Done.
+Queue Display Board (TV / student web page): Current token being printed, estimated wait time, students check token status from phone on LAN.
+All jobs logged to SQLite: token, name, roll number, file, pages, cost, timestamp, status.
+Stack: Python, Flask, CUPS (print management), SQLite, HX711 library</w:t>
+            </w:r>
+          </w:p>
+        </w:tc>
+      </w:tr>
+      <w:tr>
+        <w:trPr>
+          <w:tblHeader w:val="false"/>
+        </w:trPr>
+        <w:tc>
+          <w:tcPr>
+            <w:tcW w:type="dxa" w:w="9360"/>
+            <w:tcBorders>
+              <w:top w:val="none" w:color="FFFFFF" w:sz="0"/>
+              <w:left w:val="none" w:color="FFFFFF" w:sz="0"/>
+              <w:bottom w:val="none" w:color="FFFFFF" w:sz="0"/>
+              <w:right w:val="none" w:color="FFFFFF" w:sz="0"/>
+            </w:tcBorders>
+            <w:shd w:fill="01579B" w:val="clear"/>
+            <w:tcMar>
+              <w:top w:type="dxa" w:w="80"/>
+              <w:left w:type="dxa" w:w="140"/>
+              <w:bottom w:type="dxa" w:w="80"/>
+              <w:right w:type="dxa" w:w="140"/>
+            </w:tcMar>
+            <w:vAlign w:val="top"/>
+          </w:tcPr>
+          <w:p>
+            <w:pPr>
+              <w:spacing w:after="80" w:before="0"/>
+              <w:jc w:val="left"/>
+            </w:pPr>
+            <w:r>
+              <w:rPr>
+                <w:rFonts w:ascii="Arial" w:cs="Arial" w:eastAsia="Arial" w:hAnsi="Arial"/>
+                <w:b/>
+                <w:bCs/>
+                <w:i w:val="false"/>
+                <w:iCs w:val="false"/>
+                <w:color w:val="FFFFFF"/>
+                <w:sz w:val="20"/>
+                <w:szCs w:val="20"/>
+              </w:rPr>
+              <w:t xml:space="preserve">Deliverables</w:t>
+            </w:r>
+          </w:p>
+        </w:tc>
+      </w:tr>
+      <w:tr>
+        <w:trPr>
+          <w:tblHeader w:val="false"/>
+        </w:trPr>
+        <w:tc>
+          <w:tcPr>
+            <w:tcW w:type="dxa" w:w="9360"/>
+            <w:tcBorders>
+              <w:top w:val="single" w:color="CCCCCC" w:sz="1"/>
+              <w:left w:val="single" w:color="CCCCCC" w:sz="1"/>
+              <w:bottom w:val="single" w:color="CCCCCC" w:sz="1"/>
+              <w:right w:val="single" w:color="CCCCCC" w:sz="1"/>
+            </w:tcBorders>
+            <w:tcMar>
+              <w:top w:type="dxa" w:w="80"/>
+              <w:left w:type="dxa" w:w="140"/>
+              <w:bottom w:type="dxa" w:w="80"/>
+              <w:right w:type="dxa" w:w="140"/>
+            </w:tcMar>
+            <w:vAlign w:val="top"/>
+          </w:tcPr>
+          <w:tbl>
+            <w:tblPr>
+              <w:tblW w:type="dxa" w:w="9260"/>
+              <w:tblBorders>
+                <w:top w:val="single" w:color="auto" w:sz="4"/>
+                <w:left w:val="single" w:color="auto" w:sz="4"/>
+                <w:bottom w:val="single" w:color="auto" w:sz="4"/>
+                <w:right w:val="single" w:color="auto" w:sz="4"/>
+                <w:insideH w:val="single" w:color="auto" w:sz="4"/>
+                <w:insideV w:val="single" w:color="auto" w:sz="4"/>
+              </w:tblBorders>
+            </w:tblPr>
+            <w:tblGrid>
+              <w:gridCol w:w="480"/>
+              <w:gridCol w:w="8880"/>
+            </w:tblGrid>
+            <w:tr>
+              <w:trPr>
+                <w:tblHeader w:val="false"/>
+              </w:trPr>
+              <w:tc>
+                <w:tcPr>
+                  <w:tcW w:type="dxa" w:w="480"/>
+                  <w:tcBorders>
+                    <w:top w:val="single" w:color="CCCCCC" w:sz="1"/>
+                    <w:left w:val="single" w:color="CCCCCC" w:sz="1"/>
+                    <w:bottom w:val="single" w:color="CCCCCC" w:sz="1"/>
+                    <w:right w:val="single" w:color="CCCCCC" w:sz="1"/>
+                  </w:tcBorders>
+                  <w:shd w:fill="E1F5FE" w:val="clear"/>
+                  <w:tcMar>
+                    <w:top w:type="dxa" w:w="80"/>
+                    <w:left w:type="dxa" w:w="140"/>
+                    <w:bottom w:type="dxa" w:w="80"/>
+                    <w:right w:type="dxa" w:w="140"/>
+                  </w:tcMar>
+                  <w:vAlign w:val="top"/>
+                </w:tcPr>
+                <w:p>
+                  <w:pPr>
+                    <w:spacing w:after="80" w:before="0"/>
+                    <w:jc w:val="center"/>
+                  </w:pPr>
+                  <w:r>
+                    <w:rPr>
+                      <w:rFonts w:ascii="Arial" w:cs="Arial" w:eastAsia="Arial" w:hAnsi="Arial"/>
+                      <w:b/>
+                      <w:bCs/>
+                      <w:i w:val="false"/>
+                      <w:iCs w:val="false"/>
+                      <w:color w:val="01579B"/>
+                      <w:sz w:val="20"/>
+                      <w:szCs w:val="20"/>
+                    </w:rPr>
+                    <w:t xml:space="preserve">1.</w:t>
+                  </w:r>
+                </w:p>
+              </w:tc>
+              <w:tc>
+                <w:tcPr>
+                  <w:tcW w:type="dxa" w:w="8880"/>
+                  <w:tcBorders>
+                    <w:top w:val="single" w:color="CCCCCC" w:sz="1"/>
+                    <w:left w:val="single" w:color="CCCCCC" w:sz="1"/>
+                    <w:bottom w:val="single" w:color="CCCCCC" w:sz="1"/>
+                    <w:right w:val="single" w:color="CCCCCC" w:sz="1"/>
+                  </w:tcBorders>
+                  <w:shd w:fill="E1F5FE" w:val="clear"/>
+                  <w:tcMar>
+                    <w:top w:type="dxa" w:w="80"/>
+                    <w:left w:type="dxa" w:w="140"/>
+                    <w:bottom w:type="dxa" w:w="80"/>
+                    <w:right w:type="dxa" w:w="140"/>
+                  </w:tcMar>
+                  <w:vAlign w:val="top"/>
+                </w:tcPr>
+                <w:p>
+                  <w:pPr>
+                    <w:spacing w:after="80" w:before="0"/>
+                    <w:jc w:val="left"/>
+                  </w:pPr>
+                  <w:r>
+                    <w:rPr>
+                      <w:rFonts w:ascii="Arial" w:cs="Arial" w:eastAsia="Arial" w:hAnsi="Arial"/>
+                      <w:b w:val="false"/>
+                      <w:bCs w:val="false"/>
+                      <w:i w:val="false"/>
+                      <w:iCs w:val="false"/>
+                      <w:color w:val="000000"/>
+                      <w:sz w:val="20"/>
+                      <w:szCs w:val="20"/>
+                    </w:rPr>
+                    <w:t xml:space="preserve">Circuit diagram — load cell + HX711 wired to RPi GPIO, USB printer and hub connection</w:t>
+                  </w:r>
+                </w:p>
+              </w:tc>
+            </w:tr>
+            <w:tr>
+              <w:trPr>
+                <w:tblHeader w:val="false"/>
+              </w:trPr>
+              <w:tc>
+                <w:tcPr>
+                  <w:tcW w:type="dxa" w:w="480"/>
+                  <w:tcBorders>
+                    <w:top w:val="single" w:color="CCCCCC" w:sz="1"/>
+                    <w:left w:val="single" w:color="CCCCCC" w:sz="1"/>
+                    <w:bottom w:val="single" w:color="CCCCCC" w:sz="1"/>
+                    <w:right w:val="single" w:color="CCCCCC" w:sz="1"/>
+                  </w:tcBorders>
+                  <w:shd w:fill="FFFFFF" w:val="clear"/>
+                  <w:tcMar>
+                    <w:top w:type="dxa" w:w="80"/>
+                    <w:left w:type="dxa" w:w="140"/>
+                    <w:bottom w:type="dxa" w:w="80"/>
+                    <w:right w:type="dxa" w:w="140"/>
+                  </w:tcMar>
+                  <w:vAlign w:val="top"/>
+                </w:tcPr>
+                <w:p>
+                  <w:pPr>
+                    <w:spacing w:after="80" w:before="0"/>
+                    <w:jc w:val="center"/>
+                  </w:pPr>
+                  <w:r>
+                    <w:rPr>
+                      <w:rFonts w:ascii="Arial" w:cs="Arial" w:eastAsia="Arial" w:hAnsi="Arial"/>
+                      <w:b/>
+                      <w:bCs/>
+                      <w:i w:val="false"/>
+                      <w:iCs w:val="false"/>
+                      <w:color w:val="01579B"/>
+                      <w:sz w:val="20"/>
+                      <w:szCs w:val="20"/>
+                    </w:rPr>
+                    <w:t xml:space="preserve">2.</w:t>
+                  </w:r>
+                </w:p>
+              </w:tc>
+              <w:tc>
+                <w:tcPr>
+                  <w:tcW w:type="dxa" w:w="8880"/>
+                  <w:tcBorders>
+                    <w:top w:val="single" w:color="CCCCCC" w:sz="1"/>
+                    <w:left w:val="single" w:color="CCCCCC" w:sz="1"/>
+                    <w:bottom w:val="single" w:color="CCCCCC" w:sz="1"/>
+                    <w:right w:val="single" w:color="CCCCCC" w:sz="1"/>
+                  </w:tcBorders>
+                  <w:shd w:fill="FFFFFF" w:val="clear"/>
+                  <w:tcMar>
+                    <w:top w:type="dxa" w:w="80"/>
+                    <w:left w:type="dxa" w:w="140"/>
+                    <w:bottom w:type="dxa" w:w="80"/>
+                    <w:right w:type="dxa" w:w="140"/>
+                  </w:tcMar>
+                  <w:vAlign w:val="top"/>
+                </w:tcPr>
+                <w:p>
+                  <w:pPr>
+                    <w:spacing w:after="80" w:before="0"/>
+                    <w:jc w:val="left"/>
+                  </w:pPr>
+                  <w:r>
+                    <w:rPr>
+                      <w:rFonts w:ascii="Arial" w:cs="Arial" w:eastAsia="Arial" w:hAnsi="Arial"/>
+                      <w:b w:val="false"/>
+                      <w:bCs w:val="false"/>
+                      <w:i w:val="false"/>
+                      <w:iCs w:val="false"/>
+                      <w:color w:val="000000"/>
+                      <w:sz w:val="20"/>
+                      <w:szCs w:val="20"/>
+                    </w:rPr>
+                    <w:t xml:space="preserve">paper_sensor.py — HX711 read, weight-to-sheet-count conversion, low paper alert logic</w:t>
+                  </w:r>
+                </w:p>
+              </w:tc>
+            </w:tr>
+            <w:tr>
+              <w:trPr>
+                <w:tblHeader w:val="false"/>
+              </w:trPr>
+              <w:tc>
+                <w:tcPr>
+                  <w:tcW w:type="dxa" w:w="480"/>
+                  <w:tcBorders>
+                    <w:top w:val="single" w:color="CCCCCC" w:sz="1"/>
+                    <w:left w:val="single" w:color="CCCCCC" w:sz="1"/>
+                    <w:bottom w:val="single" w:color="CCCCCC" w:sz="1"/>
+                    <w:right w:val="single" w:color="CCCCCC" w:sz="1"/>
+                  </w:tcBorders>
+                  <w:shd w:fill="E1F5FE" w:val="clear"/>
+                  <w:tcMar>
+                    <w:top w:type="dxa" w:w="80"/>
+                    <w:left w:type="dxa" w:w="140"/>
+                    <w:bottom w:type="dxa" w:w="80"/>
+                    <w:right w:type="dxa" w:w="140"/>
+                  </w:tcMar>
+                  <w:vAlign w:val="top"/>
+                </w:tcPr>
+                <w:p>
+                  <w:pPr>
+                    <w:spacing w:after="80" w:before="0"/>
+                    <w:jc w:val="center"/>
+                  </w:pPr>
+                  <w:r>
+                    <w:rPr>
+                      <w:rFonts w:ascii="Arial" w:cs="Arial" w:eastAsia="Arial" w:hAnsi="Arial"/>
+                      <w:b/>
+                      <w:bCs/>
+                      <w:i w:val="false"/>
+                      <w:iCs w:val="false"/>
+                      <w:color w:val="01579B"/>
+                      <w:sz w:val="20"/>
+                      <w:szCs w:val="20"/>
+                    </w:rPr>
+                    <w:t xml:space="preserve">3.</w:t>
+                  </w:r>
+                </w:p>
+              </w:tc>
+              <w:tc>
+                <w:tcPr>
+                  <w:tcW w:type="dxa" w:w="8880"/>
+                  <w:tcBorders>
+                    <w:top w:val="single" w:color="CCCCCC" w:sz="1"/>
+                    <w:left w:val="single" w:color="CCCCCC" w:sz="1"/>
+                    <w:bottom w:val="single" w:color="CCCCCC" w:sz="1"/>
+                    <w:right w:val="single" w:color="CCCCCC" w:sz="1"/>
+                  </w:tcBorders>
+                  <w:shd w:fill="E1F5FE" w:val="clear"/>
+                  <w:tcMar>
+                    <w:top w:type="dxa" w:w="80"/>
+                    <w:left w:type="dxa" w:w="140"/>
+                    <w:bottom w:type="dxa" w:w="80"/>
+                    <w:right w:type="dxa" w:w="140"/>
+                  </w:tcMar>
+                  <w:vAlign w:val="top"/>
+                </w:tcPr>
+                <w:p>
+                  <w:pPr>
+                    <w:spacing w:after="80" w:before="0"/>
+                    <w:jc w:val="left"/>
+                  </w:pPr>
+                  <w:r>
+                    <w:rPr>
+                      <w:rFonts w:ascii="Arial" w:cs="Arial" w:eastAsia="Arial" w:hAnsi="Arial"/>
+                      <w:b w:val="false"/>
+                      <w:bCs w:val="false"/>
+                      <w:i w:val="false"/>
+                      <w:iCs w:val="false"/>
+                      <w:color w:val="000000"/>
+                      <w:sz w:val="20"/>
+                      <w:szCs w:val="20"/>
+                    </w:rPr>
+                    <w:t xml:space="preserve">Flask web portal — file upload, job submission, token assignment, queue status page</w:t>
+                  </w:r>
+                </w:p>
+              </w:tc>
+            </w:tr>
+            <w:tr>
+              <w:trPr>
+                <w:tblHeader w:val="false"/>
+              </w:trPr>
+              <w:tc>
+                <w:tcPr>
+                  <w:tcW w:type="dxa" w:w="480"/>
+                  <w:tcBorders>
+                    <w:top w:val="single" w:color="CCCCCC" w:sz="1"/>
+                    <w:left w:val="single" w:color="CCCCCC" w:sz="1"/>
+                    <w:bottom w:val="single" w:color="CCCCCC" w:sz="1"/>
+                    <w:right w:val="single" w:color="CCCCCC" w:sz="1"/>
+                  </w:tcBorders>
+                  <w:shd w:fill="FFFFFF" w:val="clear"/>
+                  <w:tcMar>
+                    <w:top w:type="dxa" w:w="80"/>
+                    <w:left w:type="dxa" w:w="140"/>
+                    <w:bottom w:type="dxa" w:w="80"/>
+                    <w:right w:type="dxa" w:w="140"/>
+                  </w:tcMar>
+                  <w:vAlign w:val="top"/>
+                </w:tcPr>
+                <w:p>
+                  <w:pPr>
+                    <w:spacing w:after="80" w:before="0"/>
+                    <w:jc w:val="center"/>
+                  </w:pPr>
+                  <w:r>
+                    <w:rPr>
+                      <w:rFonts w:ascii="Arial" w:cs="Arial" w:eastAsia="Arial" w:hAnsi="Arial"/>
+                      <w:b/>
+                      <w:bCs/>
+                      <w:i w:val="false"/>
+                      <w:iCs w:val="false"/>
+                      <w:color w:val="01579B"/>
+                      <w:sz w:val="20"/>
+                      <w:szCs w:val="20"/>
+                    </w:rPr>
+                    <w:t xml:space="preserve">4.</w:t>
+                  </w:r>
+                </w:p>
+              </w:tc>
+              <w:tc>
+                <w:tcPr>
+                  <w:tcW w:type="dxa" w:w="8880"/>
+                  <w:tcBorders>
+                    <w:top w:val="single" w:color="CCCCCC" w:sz="1"/>
+                    <w:left w:val="single" w:color="CCCCCC" w:sz="1"/>
+                    <w:bottom w:val="single" w:color="CCCCCC" w:sz="1"/>
+                    <w:right w:val="single" w:color="CCCCCC" w:sz="1"/>
+                  </w:tcBorders>
+                  <w:shd w:fill="FFFFFF" w:val="clear"/>
+                  <w:tcMar>
+                    <w:top w:type="dxa" w:w="80"/>
+                    <w:left w:type="dxa" w:w="140"/>
+                    <w:bottom w:type="dxa" w:w="80"/>
+                    <w:right w:type="dxa" w:w="140"/>
+                  </w:tcMar>
+                  <w:vAlign w:val="top"/>
+                </w:tcPr>
+                <w:p>
+                  <w:pPr>
+                    <w:spacing w:after="80" w:before="0"/>
+                    <w:jc w:val="left"/>
+                  </w:pPr>
+                  <w:r>
+                    <w:rPr>
+                      <w:rFonts w:ascii="Arial" w:cs="Arial" w:eastAsia="Arial" w:hAnsi="Arial"/>
+                      <w:b w:val="false"/>
+                      <w:bCs w:val="false"/>
+                      <w:i w:val="false"/>
+                      <w:iCs w:val="false"/>
+                      <w:color w:val="000000"/>
+                      <w:sz w:val="20"/>
+                      <w:szCs w:val="20"/>
+                    </w:rPr>
+                    <w:t xml:space="preserve">Operator dashboard — live job queue, one-click print via CUPS, paper count with alert banner</w:t>
+                  </w:r>
+                </w:p>
+              </w:tc>
+            </w:tr>
+            <w:tr>
+              <w:trPr>
+                <w:tblHeader w:val="false"/>
+              </w:trPr>
+              <w:tc>
+                <w:tcPr>
+                  <w:tcW w:type="dxa" w:w="480"/>
+                  <w:tcBorders>
+                    <w:top w:val="single" w:color="CCCCCC" w:sz="1"/>
+                    <w:left w:val="single" w:color="CCCCCC" w:sz="1"/>
+                    <w:bottom w:val="single" w:color="CCCCCC" w:sz="1"/>
+                    <w:right w:val="single" w:color="CCCCCC" w:sz="1"/>
+                  </w:tcBorders>
+                  <w:shd w:fill="E1F5FE" w:val="clear"/>
+                  <w:tcMar>
+                    <w:top w:type="dxa" w:w="80"/>
+                    <w:left w:type="dxa" w:w="140"/>
+                    <w:bottom w:type="dxa" w:w="80"/>
+                    <w:right w:type="dxa" w:w="140"/>
+                  </w:tcMar>
+                  <w:vAlign w:val="top"/>
+                </w:tcPr>
+                <w:p>
+                  <w:pPr>
+                    <w:spacing w:after="80" w:before="0"/>
+                    <w:jc w:val="center"/>
+                  </w:pPr>
+                  <w:r>
+                    <w:rPr>
+                      <w:rFonts w:ascii="Arial" w:cs="Arial" w:eastAsia="Arial" w:hAnsi="Arial"/>
+                      <w:b/>
+                      <w:bCs/>
+                      <w:i w:val="false"/>
+                      <w:iCs w:val="false"/>
+                      <w:color w:val="01579B"/>
+                      <w:sz w:val="20"/>
+                      <w:szCs w:val="20"/>
+                    </w:rPr>
+                    <w:t xml:space="preserve">5.</w:t>
+                  </w:r>
+                </w:p>
+              </w:tc>
+              <w:tc>
+                <w:tcPr>
+                  <w:tcW w:type="dxa" w:w="8880"/>
+                  <w:tcBorders>
+                    <w:top w:val="single" w:color="CCCCCC" w:sz="1"/>
+                    <w:left w:val="single" w:color="CCCCCC" w:sz="1"/>
+                    <w:bottom w:val="single" w:color="CCCCCC" w:sz="1"/>
+                    <w:right w:val="single" w:color="CCCCCC" w:sz="1"/>
+                  </w:tcBorders>
+                  <w:shd w:fill="E1F5FE" w:val="clear"/>
+                  <w:tcMar>
+                    <w:top w:type="dxa" w:w="80"/>
+                    <w:left w:type="dxa" w:w="140"/>
+                    <w:bottom w:type="dxa" w:w="80"/>
+                    <w:right w:type="dxa" w:w="140"/>
+                  </w:tcMar>
+                  <w:vAlign w:val="top"/>
+                </w:tcPr>
+                <w:p>
+                  <w:pPr>
+                    <w:spacing w:after="80" w:before="0"/>
+                    <w:jc w:val="left"/>
+                  </w:pPr>
+                  <w:r>
+                    <w:rPr>
+                      <w:rFonts w:ascii="Arial" w:cs="Arial" w:eastAsia="Arial" w:hAnsi="Arial"/>
+                      <w:b w:val="false"/>
+                      <w:bCs w:val="false"/>
+                      <w:i w:val="false"/>
+                      <w:iCs w:val="false"/>
+                      <w:color w:val="000000"/>
+                      <w:sz w:val="20"/>
+                      <w:szCs w:val="20"/>
+                    </w:rPr>
+                    <w:t xml:space="preserve">One-page report — HX711 calibration procedure, A4 70 GSM sheet weight calculation, CUPS integration, queue wait-time estimation formula</w:t>
+                  </w:r>
+                </w:p>
+              </w:tc>
+            </w:tr>
+          </w:tbl>
+          <w:p/>
+        </w:tc>
+      </w:tr>
+    </w:tbl>
+    <w:p>
+      <w:pPr>
+        <w:spacing w:after="80" w:before="0"/>
+        <w:jc w:val="left"/>
+      </w:pPr>
+      <w:r>
+        <w:br w:type="page"/>
+      </w:r>
+    </w:p>
+    <w:tbl>
+      <w:tblPr>
+        <w:tblW w:type="dxa" w:w="9360"/>
+        <w:tblBorders>
           <w:top w:val="single" w:color="5D4037" w:sz="3"/>
           <w:left w:val="single" w:color="5D4037" w:sz="6"/>
           <w:bottom w:val="single" w:color="5D4037" w:sz="3"/>
@@ -6249,7 +7204,7 @@
         <w:sz w:val="16"/>
         <w:szCs w:val="16"/>
       </w:rPr>
-      <w:t xml:space="preserve">Academic Year 2025–26  |  6 Project Topics  |  Hardware-based implementations only</w:t>
+      <w:t xml:space="preserve">Academic Year 2025–26  |  7 Project Topics  |  Hardware-based implementations only</w:t>
     </w:r>
     <w:r>
       <w:rPr>

</xml_diff>